<commit_message>
OK, so I'm validating what I did, but it does appear that I am putting the necessary vx_* information in the target file. I will need to create a manual unit test...and definitely worry about performance (which is why I'll probably break this down into 1200 files per experiment)...that...and the fact that a fully "deflated" csv file is currently like 50+ GB!
</commit_message>
<xml_diff>
--- a/2025/Documentation/Autoencoder_Details.docx
+++ b/2025/Documentation/Autoencoder_Details.docx
@@ -4258,18 +4258,135 @@
         <w:t xml:space="preserve">That will look at the number of combinations of </w:t>
       </w:r>
       <w:proofErr w:type="spellStart"/>
-      <w:r>
-        <w:t>x,y,z</w:t>
+      <w:proofErr w:type="gramStart"/>
+      <w:r>
+        <w:t>x,y</w:t>
+      </w:r>
+      <w:proofErr w:type="gramEnd"/>
+      <w:r>
+        <w:t>,z</w:t>
       </w:r>
       <w:proofErr w:type="spellEnd"/>
       <w:r>
         <w:t xml:space="preserve"> per time slice and see if they are consistent.</w:t>
       </w:r>
     </w:p>
+    <w:p>
+      <w:pPr>
+        <w:pStyle w:val="ListParagraph"/>
+      </w:pPr>
+    </w:p>
+    <w:p>
+      <w:pPr>
+        <w:pStyle w:val="ListParagraph"/>
+      </w:pPr>
+    </w:p>
+    <w:p>
+      <w:pPr>
+        <w:pStyle w:val="ListParagraph"/>
+      </w:pPr>
+      <w:r>
+        <w:t xml:space="preserve">Seems that even in the “source” data </w:t>
+      </w:r>
+      <w:r>
+        <w:t>which in my computer is:</w:t>
+      </w:r>
+      <w:r>
+        <w:br/>
+      </w:r>
+      <w:r>
+        <w:t>/Users/kkreth/PycharmProjects/data/all_data_cleaned_dtype_correct</w:t>
+      </w:r>
+    </w:p>
+    <w:p>
+      <w:pPr>
+        <w:pStyle w:val="ListParagraph"/>
+      </w:pPr>
+    </w:p>
+    <w:p>
+      <w:pPr>
+        <w:pStyle w:val="ListParagraph"/>
+      </w:pPr>
+    </w:p>
+    <w:p>
+      <w:pPr>
+        <w:pStyle w:val="ListParagraph"/>
+      </w:pPr>
+      <w:r>
+        <w:drawing>
+          <wp:inline distT="0" distB="0" distL="0" distR="0" wp14:anchorId="37F74C3E" wp14:editId="04728FCC">
+            <wp:extent cx="5943600" cy="3567430"/>
+            <wp:effectExtent l="0" t="0" r="0" b="1270"/>
+            <wp:docPr id="1772856837" name="Picture 1"/>
+            <wp:cNvGraphicFramePr>
+              <a:graphicFrameLocks xmlns:a="http://schemas.openxmlformats.org/drawingml/2006/main" noChangeAspect="1"/>
+            </wp:cNvGraphicFramePr>
+            <a:graphic xmlns:a="http://schemas.openxmlformats.org/drawingml/2006/main">
+              <a:graphicData uri="http://schemas.openxmlformats.org/drawingml/2006/picture">
+                <pic:pic xmlns:pic="http://schemas.openxmlformats.org/drawingml/2006/picture">
+                  <pic:nvPicPr>
+                    <pic:cNvPr id="1772856837" name=""/>
+                    <pic:cNvPicPr/>
+                  </pic:nvPicPr>
+                  <pic:blipFill>
+                    <a:blip r:embed="rId12"/>
+                    <a:stretch>
+                      <a:fillRect/>
+                    </a:stretch>
+                  </pic:blipFill>
+                  <pic:spPr>
+                    <a:xfrm>
+                      <a:off x="0" y="0"/>
+                      <a:ext cx="5943600" cy="3567430"/>
+                    </a:xfrm>
+                    <a:prstGeom prst="rect">
+                      <a:avLst/>
+                    </a:prstGeom>
+                  </pic:spPr>
+                </pic:pic>
+              </a:graphicData>
+            </a:graphic>
+          </wp:inline>
+        </w:drawing>
+      </w:r>
+    </w:p>
+    <w:p/>
+    <w:p>
+      <w:r>
+        <w:t>You can see that yes…indeed there SHOULD be an entry that would explain this error log:</w:t>
+      </w:r>
+      <w:r>
+        <w:br/>
+      </w:r>
+      <w:r>
+        <w:lastRenderedPageBreak/>
+        <w:br/>
+      </w:r>
+      <w:r>
+        <w:t>Or this nonsense:</w:t>
+      </w:r>
+    </w:p>
+    <w:p>
+      <w:r>
+        <w:t>2025-04-20 23:30:45,102 - __main__ - INFO - Processing row 1/5000 in 7p2.pkl</w:t>
+      </w:r>
+    </w:p>
+    <w:p>
+      <w:r>
+        <w:t xml:space="preserve">2025-04-20 23:30:45,129 - __main__ - WARNING - Found 0 matches for coordinate </w:t>
+      </w:r>
+      <w:r>
+        <w:rPr>
+          <w:highlight w:val="yellow"/>
+        </w:rPr>
+        <w:t>(-125, 87, -33) at time 561</w:t>
+      </w:r>
+    </w:p>
+    <w:p/>
     <w:p/>
     <w:p/>
     <w:sectPr>
-      <w:footerReference w:type="default" r:id="rId12"/>
+      <w:footerReference w:type="default" r:id="rId13"/>
       <w:pgSz w:w="12240" w:h="15840"/>
       <w:pgMar w:top="720" w:right="1440" w:bottom="1800" w:left="1440" w:header="720" w:footer="720" w:gutter="0"/>
       <w:cols w:space="720"/>

</xml_diff>

<commit_message>
Validation work was done with this version of code. Right now, we have "performance" concerns populating the dataframes, this is what I'll work on next.
</commit_message>
<xml_diff>
--- a/2025/Documentation/Autoencoder_Details.docx
+++ b/2025/Documentation/Autoencoder_Details.docx
@@ -4382,11 +4382,908 @@
         <w:t>(-125, 87, -33) at time 561</w:t>
       </w:r>
     </w:p>
+    <w:p>
+      <w:pPr>
+        <w:pBdr>
+          <w:bottom w:val="single" w:sz="6" w:space="1" w:color="auto"/>
+        </w:pBdr>
+      </w:pPr>
+    </w:p>
+    <w:p>
+      <w:r>
+        <w:t xml:space="preserve">OK, so we need to perform a “unit </w:t>
+      </w:r>
+      <w:proofErr w:type="gramStart"/>
+      <w:r>
+        <w:t>test”…</w:t>
+      </w:r>
+      <w:proofErr w:type="gramEnd"/>
+      <w:r>
+        <w:t>we have one that will be formal, once we have generated all data</w:t>
+      </w:r>
+      <w:r>
+        <w:t>, but we need a manual one for now.</w:t>
+      </w:r>
+    </w:p>
+    <w:p/>
+    <w:p>
+      <w:r>
+        <w:t>Let’s look at 10p4, time 262</w:t>
+      </w:r>
+    </w:p>
+    <w:p>
+      <w:proofErr w:type="spellStart"/>
+      <w:proofErr w:type="gramStart"/>
+      <w:r>
+        <w:t>X,y</w:t>
+      </w:r>
+      <w:proofErr w:type="gramEnd"/>
+      <w:r>
+        <w:t>,z</w:t>
+      </w:r>
+      <w:proofErr w:type="spellEnd"/>
+      <w:r>
+        <w:t xml:space="preserve"> coordinates of -42,</w:t>
+      </w:r>
+      <w:proofErr w:type="gramStart"/>
+      <w:r>
+        <w:t>75,-</w:t>
+      </w:r>
+      <w:proofErr w:type="gramEnd"/>
+      <w:r>
+        <w:t>21</w:t>
+      </w:r>
+    </w:p>
+    <w:p/>
+    <w:p>
+      <w:r>
+        <w:t xml:space="preserve">Here are the relative </w:t>
+      </w:r>
+      <w:proofErr w:type="spellStart"/>
+      <w:r>
+        <w:t>x_enumerated</w:t>
+      </w:r>
+      <w:proofErr w:type="spellEnd"/>
+      <w:r>
+        <w:t>:</w:t>
+      </w:r>
+      <w:r>
+        <w:br/>
+      </w:r>
+    </w:p>
+    <w:p>
+      <w:pPr>
+        <w:shd w:val="clear" w:color="auto" w:fill="000000"/>
+        <w:tabs>
+          <w:tab w:val="left" w:pos="916"/>
+          <w:tab w:val="left" w:pos="1832"/>
+          <w:tab w:val="left" w:pos="2748"/>
+          <w:tab w:val="left" w:pos="3664"/>
+          <w:tab w:val="left" w:pos="4580"/>
+          <w:tab w:val="left" w:pos="5496"/>
+          <w:tab w:val="left" w:pos="6412"/>
+          <w:tab w:val="left" w:pos="7328"/>
+          <w:tab w:val="left" w:pos="8244"/>
+          <w:tab w:val="left" w:pos="9160"/>
+          <w:tab w:val="left" w:pos="10076"/>
+          <w:tab w:val="left" w:pos="10992"/>
+          <w:tab w:val="left" w:pos="11908"/>
+          <w:tab w:val="left" w:pos="12824"/>
+          <w:tab w:val="left" w:pos="13740"/>
+          <w:tab w:val="left" w:pos="14656"/>
+        </w:tabs>
+        <w:spacing w:after="0" w:line="240" w:lineRule="auto"/>
+        <w:rPr>
+          <w:rFonts w:ascii="Courier New" w:eastAsia="Times New Roman" w:hAnsi="Courier New" w:cs="Courier New"/>
+          <w:color w:val="FFFFFF"/>
+          <w:sz w:val="20"/>
+          <w:szCs w:val="20"/>
+          <w:lang w:eastAsia="en-US"/>
+        </w:rPr>
+      </w:pPr>
+      <w:r>
+        <w:rPr>
+          <w:rFonts w:ascii="Courier New" w:eastAsia="Times New Roman" w:hAnsi="Courier New" w:cs="Courier New"/>
+          <w:color w:val="D0BF69"/>
+          <w:sz w:val="20"/>
+          <w:szCs w:val="20"/>
+          <w:lang w:eastAsia="en-US"/>
+        </w:rPr>
+        <w:t>-50</w:t>
+      </w:r>
+      <w:r>
+        <w:rPr>
+          <w:rFonts w:ascii="Courier New" w:eastAsia="Times New Roman" w:hAnsi="Courier New" w:cs="Courier New"/>
+          <w:color w:val="FFFFFF"/>
+          <w:sz w:val="20"/>
+          <w:szCs w:val="20"/>
+          <w:lang w:eastAsia="en-US"/>
+        </w:rPr>
+        <w:t>,</w:t>
+      </w:r>
+      <w:r>
+        <w:rPr>
+          <w:rFonts w:ascii="Courier New" w:eastAsia="Times New Roman" w:hAnsi="Courier New" w:cs="Courier New"/>
+          <w:color w:val="FFFFFF"/>
+          <w:sz w:val="20"/>
+          <w:szCs w:val="20"/>
+          <w:lang w:eastAsia="en-US"/>
+        </w:rPr>
+        <w:br/>
+      </w:r>
+      <w:r>
+        <w:rPr>
+          <w:rFonts w:ascii="Courier New" w:eastAsia="Times New Roman" w:hAnsi="Courier New" w:cs="Courier New"/>
+          <w:color w:val="D0BF69"/>
+          <w:sz w:val="20"/>
+          <w:szCs w:val="20"/>
+          <w:lang w:eastAsia="en-US"/>
+        </w:rPr>
+        <w:t>-46</w:t>
+      </w:r>
+      <w:r>
+        <w:rPr>
+          <w:rFonts w:ascii="Courier New" w:eastAsia="Times New Roman" w:hAnsi="Courier New" w:cs="Courier New"/>
+          <w:color w:val="FFFFFF"/>
+          <w:sz w:val="20"/>
+          <w:szCs w:val="20"/>
+          <w:lang w:eastAsia="en-US"/>
+        </w:rPr>
+        <w:t>,</w:t>
+      </w:r>
+      <w:r>
+        <w:rPr>
+          <w:rFonts w:ascii="Courier New" w:eastAsia="Times New Roman" w:hAnsi="Courier New" w:cs="Courier New"/>
+          <w:color w:val="FFFFFF"/>
+          <w:sz w:val="20"/>
+          <w:szCs w:val="20"/>
+          <w:lang w:eastAsia="en-US"/>
+        </w:rPr>
+        <w:br/>
+      </w:r>
+      <w:r>
+        <w:rPr>
+          <w:rFonts w:ascii="Courier New" w:eastAsia="Times New Roman" w:hAnsi="Courier New" w:cs="Courier New"/>
+          <w:color w:val="D0BF69"/>
+          <w:sz w:val="20"/>
+          <w:szCs w:val="20"/>
+          <w:lang w:eastAsia="en-US"/>
+        </w:rPr>
+        <w:t>-42</w:t>
+      </w:r>
+      <w:r>
+        <w:rPr>
+          <w:rFonts w:ascii="Courier New" w:eastAsia="Times New Roman" w:hAnsi="Courier New" w:cs="Courier New"/>
+          <w:color w:val="FFFFFF"/>
+          <w:sz w:val="20"/>
+          <w:szCs w:val="20"/>
+          <w:lang w:eastAsia="en-US"/>
+        </w:rPr>
+        <w:t>,</w:t>
+      </w:r>
+      <w:r>
+        <w:rPr>
+          <w:rFonts w:ascii="Courier New" w:eastAsia="Times New Roman" w:hAnsi="Courier New" w:cs="Courier New"/>
+          <w:color w:val="FFFFFF"/>
+          <w:sz w:val="20"/>
+          <w:szCs w:val="20"/>
+          <w:lang w:eastAsia="en-US"/>
+        </w:rPr>
+        <w:br/>
+      </w:r>
+      <w:r>
+        <w:rPr>
+          <w:rFonts w:ascii="Courier New" w:eastAsia="Times New Roman" w:hAnsi="Courier New" w:cs="Courier New"/>
+          <w:color w:val="D0BF69"/>
+          <w:sz w:val="20"/>
+          <w:szCs w:val="20"/>
+          <w:lang w:eastAsia="en-US"/>
+        </w:rPr>
+        <w:t>-38</w:t>
+      </w:r>
+      <w:r>
+        <w:rPr>
+          <w:rFonts w:ascii="Courier New" w:eastAsia="Times New Roman" w:hAnsi="Courier New" w:cs="Courier New"/>
+          <w:color w:val="FFFFFF"/>
+          <w:sz w:val="20"/>
+          <w:szCs w:val="20"/>
+          <w:lang w:eastAsia="en-US"/>
+        </w:rPr>
+        <w:t>,</w:t>
+      </w:r>
+      <w:r>
+        <w:rPr>
+          <w:rFonts w:ascii="Courier New" w:eastAsia="Times New Roman" w:hAnsi="Courier New" w:cs="Courier New"/>
+          <w:color w:val="FFFFFF"/>
+          <w:sz w:val="20"/>
+          <w:szCs w:val="20"/>
+          <w:lang w:eastAsia="en-US"/>
+        </w:rPr>
+        <w:br/>
+      </w:r>
+      <w:r>
+        <w:rPr>
+          <w:rFonts w:ascii="Courier New" w:eastAsia="Times New Roman" w:hAnsi="Courier New" w:cs="Courier New"/>
+          <w:color w:val="D0BF69"/>
+          <w:sz w:val="20"/>
+          <w:szCs w:val="20"/>
+          <w:lang w:eastAsia="en-US"/>
+        </w:rPr>
+        <w:t>-34</w:t>
+      </w:r>
+      <w:r>
+        <w:rPr>
+          <w:rFonts w:ascii="Courier New" w:eastAsia="Times New Roman" w:hAnsi="Courier New" w:cs="Courier New"/>
+          <w:color w:val="FFFFFF"/>
+          <w:sz w:val="20"/>
+          <w:szCs w:val="20"/>
+          <w:lang w:eastAsia="en-US"/>
+        </w:rPr>
+        <w:t>,</w:t>
+      </w:r>
+    </w:p>
+    <w:p/>
+    <w:p>
+      <w:r>
+        <w:t>Y:</w:t>
+      </w:r>
+    </w:p>
+    <w:p>
+      <w:pPr>
+        <w:shd w:val="clear" w:color="auto" w:fill="000000"/>
+        <w:tabs>
+          <w:tab w:val="left" w:pos="916"/>
+          <w:tab w:val="left" w:pos="1832"/>
+          <w:tab w:val="left" w:pos="2748"/>
+          <w:tab w:val="left" w:pos="3664"/>
+          <w:tab w:val="left" w:pos="4580"/>
+          <w:tab w:val="left" w:pos="5496"/>
+          <w:tab w:val="left" w:pos="6412"/>
+          <w:tab w:val="left" w:pos="7328"/>
+          <w:tab w:val="left" w:pos="8244"/>
+          <w:tab w:val="left" w:pos="9160"/>
+          <w:tab w:val="left" w:pos="10076"/>
+          <w:tab w:val="left" w:pos="10992"/>
+          <w:tab w:val="left" w:pos="11908"/>
+          <w:tab w:val="left" w:pos="12824"/>
+          <w:tab w:val="left" w:pos="13740"/>
+          <w:tab w:val="left" w:pos="14656"/>
+        </w:tabs>
+        <w:spacing w:after="0" w:line="240" w:lineRule="auto"/>
+        <w:rPr>
+          <w:rFonts w:ascii="Courier New" w:eastAsia="Times New Roman" w:hAnsi="Courier New" w:cs="Courier New"/>
+          <w:color w:val="FFFFFF"/>
+          <w:sz w:val="20"/>
+          <w:szCs w:val="20"/>
+          <w:lang w:eastAsia="en-US"/>
+        </w:rPr>
+      </w:pPr>
+      <w:r>
+        <w:rPr>
+          <w:rFonts w:ascii="Courier New" w:eastAsia="Times New Roman" w:hAnsi="Courier New" w:cs="Courier New"/>
+          <w:color w:val="D0BF69"/>
+          <w:sz w:val="20"/>
+          <w:szCs w:val="20"/>
+          <w:lang w:eastAsia="en-US"/>
+        </w:rPr>
+        <w:t>67</w:t>
+      </w:r>
+      <w:r>
+        <w:rPr>
+          <w:rFonts w:ascii="Courier New" w:eastAsia="Times New Roman" w:hAnsi="Courier New" w:cs="Courier New"/>
+          <w:color w:val="FFFFFF"/>
+          <w:sz w:val="20"/>
+          <w:szCs w:val="20"/>
+          <w:lang w:eastAsia="en-US"/>
+        </w:rPr>
+        <w:t>,</w:t>
+      </w:r>
+      <w:r>
+        <w:rPr>
+          <w:rFonts w:ascii="Courier New" w:eastAsia="Times New Roman" w:hAnsi="Courier New" w:cs="Courier New"/>
+          <w:color w:val="FFFFFF"/>
+          <w:sz w:val="20"/>
+          <w:szCs w:val="20"/>
+          <w:lang w:eastAsia="en-US"/>
+        </w:rPr>
+        <w:br/>
+      </w:r>
+      <w:r>
+        <w:rPr>
+          <w:rFonts w:ascii="Courier New" w:eastAsia="Times New Roman" w:hAnsi="Courier New" w:cs="Courier New"/>
+          <w:color w:val="D0BF69"/>
+          <w:sz w:val="20"/>
+          <w:szCs w:val="20"/>
+          <w:lang w:eastAsia="en-US"/>
+        </w:rPr>
+        <w:t>71</w:t>
+      </w:r>
+      <w:r>
+        <w:rPr>
+          <w:rFonts w:ascii="Courier New" w:eastAsia="Times New Roman" w:hAnsi="Courier New" w:cs="Courier New"/>
+          <w:color w:val="FFFFFF"/>
+          <w:sz w:val="20"/>
+          <w:szCs w:val="20"/>
+          <w:lang w:eastAsia="en-US"/>
+        </w:rPr>
+        <w:t>,</w:t>
+      </w:r>
+      <w:r>
+        <w:rPr>
+          <w:rFonts w:ascii="Courier New" w:eastAsia="Times New Roman" w:hAnsi="Courier New" w:cs="Courier New"/>
+          <w:color w:val="FFFFFF"/>
+          <w:sz w:val="20"/>
+          <w:szCs w:val="20"/>
+          <w:lang w:eastAsia="en-US"/>
+        </w:rPr>
+        <w:br/>
+      </w:r>
+      <w:r>
+        <w:rPr>
+          <w:rFonts w:ascii="Courier New" w:eastAsia="Times New Roman" w:hAnsi="Courier New" w:cs="Courier New"/>
+          <w:color w:val="D0BF69"/>
+          <w:sz w:val="20"/>
+          <w:szCs w:val="20"/>
+          <w:lang w:eastAsia="en-US"/>
+        </w:rPr>
+        <w:t>75</w:t>
+      </w:r>
+      <w:r>
+        <w:rPr>
+          <w:rFonts w:ascii="Courier New" w:eastAsia="Times New Roman" w:hAnsi="Courier New" w:cs="Courier New"/>
+          <w:color w:val="FFFFFF"/>
+          <w:sz w:val="20"/>
+          <w:szCs w:val="20"/>
+          <w:lang w:eastAsia="en-US"/>
+        </w:rPr>
+        <w:t>,</w:t>
+      </w:r>
+      <w:r>
+        <w:rPr>
+          <w:rFonts w:ascii="Courier New" w:eastAsia="Times New Roman" w:hAnsi="Courier New" w:cs="Courier New"/>
+          <w:color w:val="FFFFFF"/>
+          <w:sz w:val="20"/>
+          <w:szCs w:val="20"/>
+          <w:lang w:eastAsia="en-US"/>
+        </w:rPr>
+        <w:br/>
+      </w:r>
+      <w:r>
+        <w:rPr>
+          <w:rFonts w:ascii="Courier New" w:eastAsia="Times New Roman" w:hAnsi="Courier New" w:cs="Courier New"/>
+          <w:color w:val="D0BF69"/>
+          <w:sz w:val="20"/>
+          <w:szCs w:val="20"/>
+          <w:lang w:eastAsia="en-US"/>
+        </w:rPr>
+        <w:t>79</w:t>
+      </w:r>
+      <w:r>
+        <w:rPr>
+          <w:rFonts w:ascii="Courier New" w:eastAsia="Times New Roman" w:hAnsi="Courier New" w:cs="Courier New"/>
+          <w:color w:val="FFFFFF"/>
+          <w:sz w:val="20"/>
+          <w:szCs w:val="20"/>
+          <w:lang w:eastAsia="en-US"/>
+        </w:rPr>
+        <w:t>,</w:t>
+      </w:r>
+      <w:r>
+        <w:rPr>
+          <w:rFonts w:ascii="Courier New" w:eastAsia="Times New Roman" w:hAnsi="Courier New" w:cs="Courier New"/>
+          <w:color w:val="FFFFFF"/>
+          <w:sz w:val="20"/>
+          <w:szCs w:val="20"/>
+          <w:lang w:eastAsia="en-US"/>
+        </w:rPr>
+        <w:br/>
+      </w:r>
+      <w:r>
+        <w:rPr>
+          <w:rFonts w:ascii="Courier New" w:eastAsia="Times New Roman" w:hAnsi="Courier New" w:cs="Courier New"/>
+          <w:color w:val="D0BF69"/>
+          <w:sz w:val="20"/>
+          <w:szCs w:val="20"/>
+          <w:lang w:eastAsia="en-US"/>
+        </w:rPr>
+        <w:t>83</w:t>
+      </w:r>
+      <w:r>
+        <w:rPr>
+          <w:rFonts w:ascii="Courier New" w:eastAsia="Times New Roman" w:hAnsi="Courier New" w:cs="Courier New"/>
+          <w:color w:val="FFFFFF"/>
+          <w:sz w:val="20"/>
+          <w:szCs w:val="20"/>
+          <w:lang w:eastAsia="en-US"/>
+        </w:rPr>
+        <w:t>,</w:t>
+      </w:r>
+    </w:p>
+    <w:p/>
+    <w:p>
+      <w:r>
+        <w:t>Z:</w:t>
+      </w:r>
+    </w:p>
+    <w:p>
+      <w:pPr>
+        <w:shd w:val="clear" w:color="auto" w:fill="000000"/>
+        <w:tabs>
+          <w:tab w:val="left" w:pos="916"/>
+          <w:tab w:val="left" w:pos="1832"/>
+          <w:tab w:val="left" w:pos="2748"/>
+          <w:tab w:val="left" w:pos="3664"/>
+          <w:tab w:val="left" w:pos="4580"/>
+          <w:tab w:val="left" w:pos="5496"/>
+          <w:tab w:val="left" w:pos="6412"/>
+          <w:tab w:val="left" w:pos="7328"/>
+          <w:tab w:val="left" w:pos="8244"/>
+          <w:tab w:val="left" w:pos="9160"/>
+          <w:tab w:val="left" w:pos="10076"/>
+          <w:tab w:val="left" w:pos="10992"/>
+          <w:tab w:val="left" w:pos="11908"/>
+          <w:tab w:val="left" w:pos="12824"/>
+          <w:tab w:val="left" w:pos="13740"/>
+          <w:tab w:val="left" w:pos="14656"/>
+        </w:tabs>
+        <w:spacing w:after="0" w:line="240" w:lineRule="auto"/>
+        <w:rPr>
+          <w:rFonts w:ascii="Courier New" w:eastAsia="Times New Roman" w:hAnsi="Courier New" w:cs="Courier New"/>
+          <w:color w:val="FFFFFF"/>
+          <w:sz w:val="20"/>
+          <w:szCs w:val="20"/>
+          <w:lang w:eastAsia="en-US"/>
+        </w:rPr>
+      </w:pPr>
+      <w:r>
+        <w:rPr>
+          <w:rFonts w:ascii="Courier New" w:eastAsia="Times New Roman" w:hAnsi="Courier New" w:cs="Courier New"/>
+          <w:color w:val="D0BF69"/>
+          <w:sz w:val="20"/>
+          <w:szCs w:val="20"/>
+          <w:lang w:eastAsia="en-US"/>
+        </w:rPr>
+        <w:t>-29</w:t>
+      </w:r>
+      <w:r>
+        <w:rPr>
+          <w:rFonts w:ascii="Courier New" w:eastAsia="Times New Roman" w:hAnsi="Courier New" w:cs="Courier New"/>
+          <w:color w:val="FFFFFF"/>
+          <w:sz w:val="20"/>
+          <w:szCs w:val="20"/>
+          <w:lang w:eastAsia="en-US"/>
+        </w:rPr>
+        <w:t>,</w:t>
+      </w:r>
+      <w:r>
+        <w:rPr>
+          <w:rFonts w:ascii="Courier New" w:eastAsia="Times New Roman" w:hAnsi="Courier New" w:cs="Courier New"/>
+          <w:color w:val="FFFFFF"/>
+          <w:sz w:val="20"/>
+          <w:szCs w:val="20"/>
+          <w:lang w:eastAsia="en-US"/>
+        </w:rPr>
+        <w:br/>
+      </w:r>
+      <w:r>
+        <w:rPr>
+          <w:rFonts w:ascii="Courier New" w:eastAsia="Times New Roman" w:hAnsi="Courier New" w:cs="Courier New"/>
+          <w:color w:val="D0BF69"/>
+          <w:sz w:val="20"/>
+          <w:szCs w:val="20"/>
+          <w:lang w:eastAsia="en-US"/>
+        </w:rPr>
+        <w:t>-25</w:t>
+      </w:r>
+      <w:r>
+        <w:rPr>
+          <w:rFonts w:ascii="Courier New" w:eastAsia="Times New Roman" w:hAnsi="Courier New" w:cs="Courier New"/>
+          <w:color w:val="FFFFFF"/>
+          <w:sz w:val="20"/>
+          <w:szCs w:val="20"/>
+          <w:lang w:eastAsia="en-US"/>
+        </w:rPr>
+        <w:t>,</w:t>
+      </w:r>
+      <w:r>
+        <w:rPr>
+          <w:rFonts w:ascii="Courier New" w:eastAsia="Times New Roman" w:hAnsi="Courier New" w:cs="Courier New"/>
+          <w:color w:val="FFFFFF"/>
+          <w:sz w:val="20"/>
+          <w:szCs w:val="20"/>
+          <w:lang w:eastAsia="en-US"/>
+        </w:rPr>
+        <w:br/>
+      </w:r>
+      <w:r>
+        <w:rPr>
+          <w:rFonts w:ascii="Courier New" w:eastAsia="Times New Roman" w:hAnsi="Courier New" w:cs="Courier New"/>
+          <w:color w:val="D0BF69"/>
+          <w:sz w:val="20"/>
+          <w:szCs w:val="20"/>
+          <w:lang w:eastAsia="en-US"/>
+        </w:rPr>
+        <w:t>-21</w:t>
+      </w:r>
+      <w:r>
+        <w:rPr>
+          <w:rFonts w:ascii="Courier New" w:eastAsia="Times New Roman" w:hAnsi="Courier New" w:cs="Courier New"/>
+          <w:color w:val="FFFFFF"/>
+          <w:sz w:val="20"/>
+          <w:szCs w:val="20"/>
+          <w:lang w:eastAsia="en-US"/>
+        </w:rPr>
+        <w:t>,</w:t>
+      </w:r>
+      <w:r>
+        <w:rPr>
+          <w:rFonts w:ascii="Courier New" w:eastAsia="Times New Roman" w:hAnsi="Courier New" w:cs="Courier New"/>
+          <w:color w:val="FFFFFF"/>
+          <w:sz w:val="20"/>
+          <w:szCs w:val="20"/>
+          <w:lang w:eastAsia="en-US"/>
+        </w:rPr>
+        <w:br/>
+      </w:r>
+      <w:r>
+        <w:rPr>
+          <w:rFonts w:ascii="Courier New" w:eastAsia="Times New Roman" w:hAnsi="Courier New" w:cs="Courier New"/>
+          <w:color w:val="D0BF69"/>
+          <w:sz w:val="20"/>
+          <w:szCs w:val="20"/>
+          <w:lang w:eastAsia="en-US"/>
+        </w:rPr>
+        <w:t>-17</w:t>
+      </w:r>
+      <w:r>
+        <w:rPr>
+          <w:rFonts w:ascii="Courier New" w:eastAsia="Times New Roman" w:hAnsi="Courier New" w:cs="Courier New"/>
+          <w:color w:val="FFFFFF"/>
+          <w:sz w:val="20"/>
+          <w:szCs w:val="20"/>
+          <w:lang w:eastAsia="en-US"/>
+        </w:rPr>
+        <w:t>,</w:t>
+      </w:r>
+      <w:r>
+        <w:rPr>
+          <w:rFonts w:ascii="Courier New" w:eastAsia="Times New Roman" w:hAnsi="Courier New" w:cs="Courier New"/>
+          <w:color w:val="FFFFFF"/>
+          <w:sz w:val="20"/>
+          <w:szCs w:val="20"/>
+          <w:lang w:eastAsia="en-US"/>
+        </w:rPr>
+        <w:br/>
+      </w:r>
+      <w:r>
+        <w:rPr>
+          <w:rFonts w:ascii="Courier New" w:eastAsia="Times New Roman" w:hAnsi="Courier New" w:cs="Courier New"/>
+          <w:color w:val="D0BF69"/>
+          <w:sz w:val="20"/>
+          <w:szCs w:val="20"/>
+          <w:lang w:eastAsia="en-US"/>
+        </w:rPr>
+        <w:t>-13</w:t>
+      </w:r>
+      <w:r>
+        <w:rPr>
+          <w:rFonts w:ascii="Courier New" w:eastAsia="Times New Roman" w:hAnsi="Courier New" w:cs="Courier New"/>
+          <w:color w:val="FFFFFF"/>
+          <w:sz w:val="20"/>
+          <w:szCs w:val="20"/>
+          <w:lang w:eastAsia="en-US"/>
+        </w:rPr>
+        <w:t>,</w:t>
+      </w:r>
+    </w:p>
+    <w:p/>
+    <w:p/>
+    <w:p>
+      <w:r>
+        <w:t>So, the CORRECT next two velocity “sets” would be from:</w:t>
+      </w:r>
+      <w:r>
+        <w:br/>
+        <w:t>(-50,</w:t>
+      </w:r>
+      <w:proofErr w:type="gramStart"/>
+      <w:r>
+        <w:t>67,-</w:t>
+      </w:r>
+      <w:proofErr w:type="gramEnd"/>
+      <w:r>
+        <w:t>29)</w:t>
+      </w:r>
+    </w:p>
+    <w:p>
+      <w:r>
+        <w:t>(-50,</w:t>
+      </w:r>
+      <w:proofErr w:type="gramStart"/>
+      <w:r>
+        <w:t>67,-</w:t>
+      </w:r>
+      <w:proofErr w:type="gramEnd"/>
+      <w:r>
+        <w:t>25)</w:t>
+      </w:r>
+    </w:p>
+    <w:p/>
+    <w:p>
+      <w:r>
+        <w:t>These velocities (for this time of 262) are:</w:t>
+      </w:r>
+      <w:r>
+        <w:br/>
+      </w:r>
+    </w:p>
+    <w:p/>
+    <w:p/>
+    <w:p>
+      <w:r>
+        <w:t xml:space="preserve">We should also verify the centroid is the same! This should be the very same </w:t>
+      </w:r>
+      <w:proofErr w:type="spellStart"/>
+      <w:r>
+        <w:t>vx</w:t>
+      </w:r>
+      <w:proofErr w:type="spellEnd"/>
+      <w:r>
+        <w:t xml:space="preserve">, </w:t>
+      </w:r>
+      <w:proofErr w:type="spellStart"/>
+      <w:r>
+        <w:t>vy</w:t>
+      </w:r>
+      <w:proofErr w:type="spellEnd"/>
+      <w:r>
+        <w:t xml:space="preserve">, and </w:t>
+      </w:r>
+      <w:proofErr w:type="spellStart"/>
+      <w:r>
+        <w:t>vz</w:t>
+      </w:r>
+      <w:proofErr w:type="spellEnd"/>
+      <w:r>
+        <w:t xml:space="preserve"> for the “</w:t>
+      </w:r>
+      <w:proofErr w:type="spellStart"/>
+      <w:proofErr w:type="gramStart"/>
+      <w:r>
+        <w:t>x,y</w:t>
+      </w:r>
+      <w:proofErr w:type="gramEnd"/>
+      <w:r>
+        <w:t>,z</w:t>
+      </w:r>
+      <w:proofErr w:type="spellEnd"/>
+      <w:r>
+        <w:t>”. This is point 63:</w:t>
+      </w:r>
+    </w:p>
+    <w:p>
+      <w:r>
+        <w:drawing>
+          <wp:inline distT="0" distB="0" distL="0" distR="0" wp14:anchorId="4799D669" wp14:editId="2A30F69A">
+            <wp:extent cx="1473200" cy="698500"/>
+            <wp:effectExtent l="0" t="0" r="0" b="0"/>
+            <wp:docPr id="1484325580" name="Picture 1" descr="A black and white screen with numbers&#10;&#10;AI-generated content may be incorrect."/>
+            <wp:cNvGraphicFramePr>
+              <a:graphicFrameLocks xmlns:a="http://schemas.openxmlformats.org/drawingml/2006/main" noChangeAspect="1"/>
+            </wp:cNvGraphicFramePr>
+            <a:graphic xmlns:a="http://schemas.openxmlformats.org/drawingml/2006/main">
+              <a:graphicData uri="http://schemas.openxmlformats.org/drawingml/2006/picture">
+                <pic:pic xmlns:pic="http://schemas.openxmlformats.org/drawingml/2006/picture">
+                  <pic:nvPicPr>
+                    <pic:cNvPr id="1484325580" name="Picture 1" descr="A black and white screen with numbers&#10;&#10;AI-generated content may be incorrect."/>
+                    <pic:cNvPicPr/>
+                  </pic:nvPicPr>
+                  <pic:blipFill>
+                    <a:blip r:embed="rId13"/>
+                    <a:stretch>
+                      <a:fillRect/>
+                    </a:stretch>
+                  </pic:blipFill>
+                  <pic:spPr>
+                    <a:xfrm>
+                      <a:off x="0" y="0"/>
+                      <a:ext cx="1473200" cy="698500"/>
+                    </a:xfrm>
+                    <a:prstGeom prst="rect">
+                      <a:avLst/>
+                    </a:prstGeom>
+                  </pic:spPr>
+                </pic:pic>
+              </a:graphicData>
+            </a:graphic>
+          </wp:inline>
+        </w:drawing>
+      </w:r>
+    </w:p>
+    <w:p/>
+    <w:p>
+      <w:r>
+        <w:drawing>
+          <wp:inline distT="0" distB="0" distL="0" distR="0" wp14:anchorId="62947DF3" wp14:editId="1918C51A">
+            <wp:extent cx="1905000" cy="2578100"/>
+            <wp:effectExtent l="0" t="0" r="0" b="0"/>
+            <wp:docPr id="1727482022" name="Picture 1" descr="A screenshot of a black screen&#10;&#10;AI-generated content may be incorrect."/>
+            <wp:cNvGraphicFramePr>
+              <a:graphicFrameLocks xmlns:a="http://schemas.openxmlformats.org/drawingml/2006/main" noChangeAspect="1"/>
+            </wp:cNvGraphicFramePr>
+            <a:graphic xmlns:a="http://schemas.openxmlformats.org/drawingml/2006/main">
+              <a:graphicData uri="http://schemas.openxmlformats.org/drawingml/2006/picture">
+                <pic:pic xmlns:pic="http://schemas.openxmlformats.org/drawingml/2006/picture">
+                  <pic:nvPicPr>
+                    <pic:cNvPr id="1727482022" name="Picture 1" descr="A screenshot of a black screen&#10;&#10;AI-generated content may be incorrect."/>
+                    <pic:cNvPicPr/>
+                  </pic:nvPicPr>
+                  <pic:blipFill>
+                    <a:blip r:embed="rId14"/>
+                    <a:stretch>
+                      <a:fillRect/>
+                    </a:stretch>
+                  </pic:blipFill>
+                  <pic:spPr>
+                    <a:xfrm>
+                      <a:off x="0" y="0"/>
+                      <a:ext cx="1905000" cy="2578100"/>
+                    </a:xfrm>
+                    <a:prstGeom prst="rect">
+                      <a:avLst/>
+                    </a:prstGeom>
+                  </pic:spPr>
+                </pic:pic>
+              </a:graphicData>
+            </a:graphic>
+          </wp:inline>
+        </w:drawing>
+      </w:r>
+      <w:r>
+        <w:br/>
+      </w:r>
+    </w:p>
+    <w:p/>
+    <w:p>
+      <w:proofErr w:type="spellStart"/>
+      <w:proofErr w:type="gramStart"/>
+      <w:r>
+        <w:lastRenderedPageBreak/>
+        <w:t>Vx,vy</w:t>
+      </w:r>
+      <w:proofErr w:type="gramEnd"/>
+      <w:r>
+        <w:t>,vz</w:t>
+      </w:r>
+      <w:proofErr w:type="spellEnd"/>
+      <w:r>
+        <w:t xml:space="preserve"> (original) of well…here is all the data:</w:t>
+      </w:r>
+      <w:r>
+        <w:br/>
+      </w:r>
+      <w:r>
+        <w:br/>
+      </w:r>
+      <w:r>
+        <w:drawing>
+          <wp:inline distT="0" distB="0" distL="0" distR="0" wp14:anchorId="70220117" wp14:editId="07BDFDED">
+            <wp:extent cx="5943600" cy="4756150"/>
+            <wp:effectExtent l="0" t="0" r="0" b="6350"/>
+            <wp:docPr id="912288625" name="Picture 1" descr="A screenshot of a computer screen&#10;&#10;AI-generated content may be incorrect."/>
+            <wp:cNvGraphicFramePr>
+              <a:graphicFrameLocks xmlns:a="http://schemas.openxmlformats.org/drawingml/2006/main" noChangeAspect="1"/>
+            </wp:cNvGraphicFramePr>
+            <a:graphic xmlns:a="http://schemas.openxmlformats.org/drawingml/2006/main">
+              <a:graphicData uri="http://schemas.openxmlformats.org/drawingml/2006/picture">
+                <pic:pic xmlns:pic="http://schemas.openxmlformats.org/drawingml/2006/picture">
+                  <pic:nvPicPr>
+                    <pic:cNvPr id="912288625" name="Picture 1" descr="A screenshot of a computer screen&#10;&#10;AI-generated content may be incorrect."/>
+                    <pic:cNvPicPr/>
+                  </pic:nvPicPr>
+                  <pic:blipFill>
+                    <a:blip r:embed="rId15"/>
+                    <a:stretch>
+                      <a:fillRect/>
+                    </a:stretch>
+                  </pic:blipFill>
+                  <pic:spPr>
+                    <a:xfrm>
+                      <a:off x="0" y="0"/>
+                      <a:ext cx="5943600" cy="4756150"/>
+                    </a:xfrm>
+                    <a:prstGeom prst="rect">
+                      <a:avLst/>
+                    </a:prstGeom>
+                  </pic:spPr>
+                </pic:pic>
+              </a:graphicData>
+            </a:graphic>
+          </wp:inline>
+        </w:drawing>
+      </w:r>
+    </w:p>
+    <w:p/>
+    <w:p>
+      <w:r>
+        <w:t>We shouldn’t have to check “all” the values, just a few spot checks. Let’s first try the first two sets of vx_1, vx_2, and vx_3 as well as vx_4, vx_5, and vx_6</w:t>
+      </w:r>
+    </w:p>
+    <w:p/>
+    <w:p>
+      <w:r>
+        <w:t xml:space="preserve">If these are the </w:t>
+      </w:r>
+      <w:proofErr w:type="spellStart"/>
+      <w:proofErr w:type="gramStart"/>
+      <w:r>
+        <w:t>x,y</w:t>
+      </w:r>
+      <w:proofErr w:type="gramEnd"/>
+      <w:r>
+        <w:t>,z</w:t>
+      </w:r>
+      <w:proofErr w:type="spellEnd"/>
+      <w:r>
+        <w:t xml:space="preserve"> coordinates IN ORDER that we expect, we need to know what these neighbors should be (in coordinate space).</w:t>
+      </w:r>
+    </w:p>
+    <w:p/>
+    <w:p/>
+    <w:p>
+      <w:r>
+        <w:lastRenderedPageBreak/>
+        <w:t>OK, so this first coordinate does NOT seem to match:</w:t>
+      </w:r>
+      <w:r>
+        <w:br/>
+      </w:r>
+      <w:r>
+        <w:drawing>
+          <wp:inline distT="0" distB="0" distL="0" distR="0" wp14:anchorId="08E64894" wp14:editId="5BD17E4D">
+            <wp:extent cx="5943600" cy="294005"/>
+            <wp:effectExtent l="0" t="0" r="0" b="0"/>
+            <wp:docPr id="370768157" name="Picture 1"/>
+            <wp:cNvGraphicFramePr>
+              <a:graphicFrameLocks xmlns:a="http://schemas.openxmlformats.org/drawingml/2006/main" noChangeAspect="1"/>
+            </wp:cNvGraphicFramePr>
+            <a:graphic xmlns:a="http://schemas.openxmlformats.org/drawingml/2006/main">
+              <a:graphicData uri="http://schemas.openxmlformats.org/drawingml/2006/picture">
+                <pic:pic xmlns:pic="http://schemas.openxmlformats.org/drawingml/2006/picture">
+                  <pic:nvPicPr>
+                    <pic:cNvPr id="370768157" name=""/>
+                    <pic:cNvPicPr/>
+                  </pic:nvPicPr>
+                  <pic:blipFill>
+                    <a:blip r:embed="rId16"/>
+                    <a:stretch>
+                      <a:fillRect/>
+                    </a:stretch>
+                  </pic:blipFill>
+                  <pic:spPr>
+                    <a:xfrm>
+                      <a:off x="0" y="0"/>
+                      <a:ext cx="5943600" cy="294005"/>
+                    </a:xfrm>
+                    <a:prstGeom prst="rect">
+                      <a:avLst/>
+                    </a:prstGeom>
+                  </pic:spPr>
+                </pic:pic>
+              </a:graphicData>
+            </a:graphic>
+          </wp:inline>
+        </w:drawing>
+      </w:r>
+    </w:p>
+    <w:p/>
+    <w:p/>
+    <w:p/>
     <w:p/>
     <w:p/>
     <w:p/>
     <w:sectPr>
-      <w:footerReference w:type="default" r:id="rId13"/>
+      <w:footerReference w:type="default" r:id="rId17"/>
       <w:pgSz w:w="12240" w:h="15840"/>
       <w:pgMar w:top="720" w:right="1440" w:bottom="1800" w:left="1440" w:header="720" w:footer="720" w:gutter="0"/>
       <w:cols w:space="720"/>

</xml_diff>

<commit_message>
MUCH faster, but still would take 2 weeks per file!
</commit_message>
<xml_diff>
--- a/2025/Documentation/Autoencoder_Details.docx
+++ b/2025/Documentation/Autoencoder_Details.docx
@@ -4997,6 +4997,45 @@
     </w:p>
     <w:p>
       <w:r>
+        <w:drawing>
+          <wp:inline distT="0" distB="0" distL="0" distR="0" wp14:anchorId="46002377" wp14:editId="7C99FA50">
+            <wp:extent cx="5943600" cy="259080"/>
+            <wp:effectExtent l="0" t="0" r="0" b="0"/>
+            <wp:docPr id="1614890276" name="Picture 1"/>
+            <wp:cNvGraphicFramePr>
+              <a:graphicFrameLocks xmlns:a="http://schemas.openxmlformats.org/drawingml/2006/main" noChangeAspect="1"/>
+            </wp:cNvGraphicFramePr>
+            <a:graphic xmlns:a="http://schemas.openxmlformats.org/drawingml/2006/main">
+              <a:graphicData uri="http://schemas.openxmlformats.org/drawingml/2006/picture">
+                <pic:pic xmlns:pic="http://schemas.openxmlformats.org/drawingml/2006/picture">
+                  <pic:nvPicPr>
+                    <pic:cNvPr id="1614890276" name=""/>
+                    <pic:cNvPicPr/>
+                  </pic:nvPicPr>
+                  <pic:blipFill>
+                    <a:blip r:embed="rId13"/>
+                    <a:stretch>
+                      <a:fillRect/>
+                    </a:stretch>
+                  </pic:blipFill>
+                  <pic:spPr>
+                    <a:xfrm>
+                      <a:off x="0" y="0"/>
+                      <a:ext cx="5943600" cy="259080"/>
+                    </a:xfrm>
+                    <a:prstGeom prst="rect">
+                      <a:avLst/>
+                    </a:prstGeom>
+                  </pic:spPr>
+                </pic:pic>
+              </a:graphicData>
+            </a:graphic>
+          </wp:inline>
+        </w:drawing>
+      </w:r>
+    </w:p>
+    <w:p>
+      <w:r>
         <w:t>(-50,</w:t>
       </w:r>
       <w:proofErr w:type="gramStart"/>
@@ -5008,16 +5047,54 @@
         <w:t>25)</w:t>
       </w:r>
     </w:p>
+    <w:p>
+      <w:r>
+        <w:drawing>
+          <wp:inline distT="0" distB="0" distL="0" distR="0" wp14:anchorId="4560CD03" wp14:editId="143E6373">
+            <wp:extent cx="5943600" cy="271780"/>
+            <wp:effectExtent l="0" t="0" r="0" b="0"/>
+            <wp:docPr id="127923724" name="Picture 1"/>
+            <wp:cNvGraphicFramePr>
+              <a:graphicFrameLocks xmlns:a="http://schemas.openxmlformats.org/drawingml/2006/main" noChangeAspect="1"/>
+            </wp:cNvGraphicFramePr>
+            <a:graphic xmlns:a="http://schemas.openxmlformats.org/drawingml/2006/main">
+              <a:graphicData uri="http://schemas.openxmlformats.org/drawingml/2006/picture">
+                <pic:pic xmlns:pic="http://schemas.openxmlformats.org/drawingml/2006/picture">
+                  <pic:nvPicPr>
+                    <pic:cNvPr id="127923724" name=""/>
+                    <pic:cNvPicPr/>
+                  </pic:nvPicPr>
+                  <pic:blipFill>
+                    <a:blip r:embed="rId14"/>
+                    <a:stretch>
+                      <a:fillRect/>
+                    </a:stretch>
+                  </pic:blipFill>
+                  <pic:spPr>
+                    <a:xfrm>
+                      <a:off x="0" y="0"/>
+                      <a:ext cx="5943600" cy="271780"/>
+                    </a:xfrm>
+                    <a:prstGeom prst="rect">
+                      <a:avLst/>
+                    </a:prstGeom>
+                  </pic:spPr>
+                </pic:pic>
+              </a:graphicData>
+            </a:graphic>
+          </wp:inline>
+        </w:drawing>
+      </w:r>
+    </w:p>
     <w:p/>
     <w:p>
       <w:r>
-        <w:t>These velocities (for this time of 262) are:</w:t>
-      </w:r>
-      <w:r>
-        <w:br/>
-      </w:r>
-    </w:p>
-    <w:p/>
+        <w:t>These velocities (for this time of 262) are</w:t>
+      </w:r>
+      <w:r>
+        <w:t xml:space="preserve"> above.</w:t>
+      </w:r>
+    </w:p>
     <w:p/>
     <w:p>
       <w:r>
@@ -5079,7 +5156,7 @@
                     <pic:cNvPicPr/>
                   </pic:nvPicPr>
                   <pic:blipFill>
-                    <a:blip r:embed="rId13"/>
+                    <a:blip r:embed="rId15"/>
                     <a:stretch>
                       <a:fillRect/>
                     </a:stretch>
@@ -5119,7 +5196,7 @@
                     <pic:cNvPicPr/>
                   </pic:nvPicPr>
                   <pic:blipFill>
-                    <a:blip r:embed="rId14"/>
+                    <a:blip r:embed="rId16"/>
                     <a:stretch>
                       <a:fillRect/>
                     </a:stretch>
@@ -5182,7 +5259,7 @@
                     <pic:cNvPicPr/>
                   </pic:nvPicPr>
                   <pic:blipFill>
-                    <a:blip r:embed="rId15"/>
+                    <a:blip r:embed="rId17"/>
                     <a:stretch>
                       <a:fillRect/>
                     </a:stretch>
@@ -5229,61 +5306,18 @@
       </w:r>
     </w:p>
     <w:p/>
-    <w:p/>
-    <w:p>
-      <w:r>
-        <w:lastRenderedPageBreak/>
-        <w:t>OK, so this first coordinate does NOT seem to match:</w:t>
-      </w:r>
-      <w:r>
-        <w:br/>
-      </w:r>
-      <w:r>
-        <w:drawing>
-          <wp:inline distT="0" distB="0" distL="0" distR="0" wp14:anchorId="08E64894" wp14:editId="5BD17E4D">
-            <wp:extent cx="5943600" cy="294005"/>
-            <wp:effectExtent l="0" t="0" r="0" b="0"/>
-            <wp:docPr id="370768157" name="Picture 1"/>
-            <wp:cNvGraphicFramePr>
-              <a:graphicFrameLocks xmlns:a="http://schemas.openxmlformats.org/drawingml/2006/main" noChangeAspect="1"/>
-            </wp:cNvGraphicFramePr>
-            <a:graphic xmlns:a="http://schemas.openxmlformats.org/drawingml/2006/main">
-              <a:graphicData uri="http://schemas.openxmlformats.org/drawingml/2006/picture">
-                <pic:pic xmlns:pic="http://schemas.openxmlformats.org/drawingml/2006/picture">
-                  <pic:nvPicPr>
-                    <pic:cNvPr id="370768157" name=""/>
-                    <pic:cNvPicPr/>
-                  </pic:nvPicPr>
-                  <pic:blipFill>
-                    <a:blip r:embed="rId16"/>
-                    <a:stretch>
-                      <a:fillRect/>
-                    </a:stretch>
-                  </pic:blipFill>
-                  <pic:spPr>
-                    <a:xfrm>
-                      <a:off x="0" y="0"/>
-                      <a:ext cx="5943600" cy="294005"/>
-                    </a:xfrm>
-                    <a:prstGeom prst="rect">
-                      <a:avLst/>
-                    </a:prstGeom>
-                  </pic:spPr>
-                </pic:pic>
-              </a:graphicData>
-            </a:graphic>
-          </wp:inline>
-        </w:drawing>
-      </w:r>
-    </w:p>
-    <w:p/>
+    <w:p>
+      <w:r>
+        <w:t>As far as a “manual” unit test, this seems to pass with flying colors!</w:t>
+      </w:r>
+    </w:p>
     <w:p/>
     <w:p/>
     <w:p/>
     <w:p/>
     <w:p/>
     <w:sectPr>
-      <w:footerReference w:type="default" r:id="rId17"/>
+      <w:footerReference w:type="default" r:id="rId18"/>
       <w:pgSz w:w="12240" w:h="15840"/>
       <w:pgMar w:top="720" w:right="1440" w:bottom="1800" w:left="1440" w:header="720" w:footer="720" w:gutter="0"/>
       <w:cols w:space="720"/>

</xml_diff>